<commit_message>
feat: cap nhat badge 7 va bao toan 100% khoang lui dong code tu file Word
</commit_message>
<xml_diff>
--- a/Mau_De_Thi_Tat_Ca_Dinh_Dang.docx
+++ b/Mau_De_Thi_Tat_Ca_Dinh_Dang.docx
@@ -107,6 +107,18 @@
                 <w:sz w:val="20"/>
               </w:rPr>
               <w:t>4. Tự động sửa &amp; bổ sung: Sau khi tải file lên, bạn hoàn toàn có thể thêm đáp án mới (E, F...) và sửa chữ tùy ý.</w:t>
+            </w:r>
+          </w:p>
+          <w:p>
+            <w:pPr>
+              <w:spacing w:after="40"/>
+            </w:pPr>
+            <w:r>
+              <w:rPr>
+                <w:color w:val="334155"/>
+                <w:sz w:val="20"/>
+              </w:rPr>
+              <w:t>5. Câu hỏi &amp; Đáp án nhiều dòng: Hỗ trợ đoạn mã lập trình (Code), văn bản xuống hàng trong cả đề bài và các phương án A, B, C, D.</w:t>
             </w:r>
           </w:p>
         </w:tc>
@@ -997,6 +1009,504 @@
         <w:t>Đáp án: B</w:t>
       </w:r>
     </w:p>
+    <w:p>
+      <w:pPr>
+        <w:spacing w:before="280" w:after="120"/>
+      </w:pPr>
+      <w:r>
+        <w:rPr>
+          <w:b/>
+          <w:color w:val="0F172A"/>
+          <w:sz w:val="26"/>
+        </w:rPr>
+        <w:t>IX. Dạng: Câu hỏi nhiều dòng kèm đoạn mã lập trình (Code Snippet)</w:t>
+      </w:r>
+    </w:p>
+    <w:p>
+      <w:r>
+        <w:rPr>
+          <w:b/>
+        </w:rPr>
+        <w:t xml:space="preserve">Câu 10: </w:t>
+      </w:r>
+      <w:r>
+        <w:t>Cho đoạn mã chương trình Kotlin sau:</w:t>
+      </w:r>
+    </w:p>
+    <w:p>
+      <w:pPr>
+        <w:spacing w:after="20"/>
+        <w:ind w:left="504"/>
+      </w:pPr>
+      <w:r>
+        <w:rPr>
+          <w:rFonts w:ascii="Consolas" w:hAnsi="Consolas"/>
+          <w:color w:val="0F172A"/>
+          <w:sz w:val="20"/>
+        </w:rPr>
+        <w:t>fun main() {</w:t>
+      </w:r>
+    </w:p>
+    <w:p>
+      <w:pPr>
+        <w:spacing w:after="20"/>
+        <w:ind w:left="504"/>
+      </w:pPr>
+      <w:r>
+        <w:rPr>
+          <w:rFonts w:ascii="Consolas" w:hAnsi="Consolas"/>
+          <w:color w:val="0F172A"/>
+          <w:sz w:val="20"/>
+        </w:rPr>
+        <w:t xml:space="preserve">    var sum = 0</w:t>
+      </w:r>
+    </w:p>
+    <w:p>
+      <w:pPr>
+        <w:spacing w:after="20"/>
+        <w:ind w:left="504"/>
+      </w:pPr>
+      <w:r>
+        <w:rPr>
+          <w:rFonts w:ascii="Consolas" w:hAnsi="Consolas"/>
+          <w:color w:val="0F172A"/>
+          <w:sz w:val="20"/>
+        </w:rPr>
+        <w:t xml:space="preserve">    for (i in 1..10) {</w:t>
+      </w:r>
+    </w:p>
+    <w:p>
+      <w:pPr>
+        <w:spacing w:after="20"/>
+        <w:ind w:left="504"/>
+      </w:pPr>
+      <w:r>
+        <w:rPr>
+          <w:rFonts w:ascii="Consolas" w:hAnsi="Consolas"/>
+          <w:color w:val="0F172A"/>
+          <w:sz w:val="20"/>
+        </w:rPr>
+        <w:t xml:space="preserve">        if (i % 2 == 0) {</w:t>
+      </w:r>
+    </w:p>
+    <w:p>
+      <w:pPr>
+        <w:spacing w:after="20"/>
+        <w:ind w:left="504"/>
+      </w:pPr>
+      <w:r>
+        <w:rPr>
+          <w:rFonts w:ascii="Consolas" w:hAnsi="Consolas"/>
+          <w:color w:val="0F172A"/>
+          <w:sz w:val="20"/>
+        </w:rPr>
+        <w:t xml:space="preserve">            sum += i</w:t>
+      </w:r>
+    </w:p>
+    <w:p>
+      <w:pPr>
+        <w:spacing w:after="20"/>
+        <w:ind w:left="504"/>
+      </w:pPr>
+      <w:r>
+        <w:rPr>
+          <w:rFonts w:ascii="Consolas" w:hAnsi="Consolas"/>
+          <w:color w:val="0F172A"/>
+          <w:sz w:val="20"/>
+        </w:rPr>
+        <w:t xml:space="preserve">        }</w:t>
+      </w:r>
+    </w:p>
+    <w:p>
+      <w:pPr>
+        <w:spacing w:after="20"/>
+        <w:ind w:left="504"/>
+      </w:pPr>
+      <w:r>
+        <w:rPr>
+          <w:rFonts w:ascii="Consolas" w:hAnsi="Consolas"/>
+          <w:color w:val="0F172A"/>
+          <w:sz w:val="20"/>
+        </w:rPr>
+        <w:t xml:space="preserve">    }</w:t>
+      </w:r>
+    </w:p>
+    <w:p>
+      <w:pPr>
+        <w:spacing w:after="20"/>
+        <w:ind w:left="504"/>
+      </w:pPr>
+      <w:r>
+        <w:rPr>
+          <w:rFonts w:ascii="Consolas" w:hAnsi="Consolas"/>
+          <w:color w:val="0F172A"/>
+          <w:sz w:val="20"/>
+        </w:rPr>
+        <w:t xml:space="preserve">    if (sum % 5 == 0)</w:t>
+      </w:r>
+    </w:p>
+    <w:p>
+      <w:pPr>
+        <w:spacing w:after="20"/>
+        <w:ind w:left="504"/>
+      </w:pPr>
+      <w:r>
+        <w:rPr>
+          <w:rFonts w:ascii="Consolas" w:hAnsi="Consolas"/>
+          <w:color w:val="0F172A"/>
+          <w:sz w:val="20"/>
+        </w:rPr>
+        <w:t xml:space="preserve">        println(sum)</w:t>
+      </w:r>
+    </w:p>
+    <w:p>
+      <w:pPr>
+        <w:spacing w:after="20"/>
+        <w:ind w:left="504"/>
+      </w:pPr>
+      <w:r>
+        <w:rPr>
+          <w:rFonts w:ascii="Consolas" w:hAnsi="Consolas"/>
+          <w:color w:val="0F172A"/>
+          <w:sz w:val="20"/>
+        </w:rPr>
+        <w:t>}</w:t>
+      </w:r>
+    </w:p>
+    <w:p>
+      <w:pPr>
+        <w:spacing w:before="80"/>
+      </w:pPr>
+      <w:r>
+        <w:t>Sau khi thực hiện đoạn mã trên, biến sum có giá trị bằng bao nhiêu?</w:t>
+      </w:r>
+    </w:p>
+    <w:tbl>
+      <w:tblPr>
+        <w:tblW w:type="auto" w:w="0"/>
+        <w:jc w:val="center"/>
+        <w:tblLook w:firstColumn="1" w:firstRow="1" w:lastColumn="0" w:lastRow="0" w:noHBand="0" w:noVBand="1" w:val="04A0"/>
+      </w:tblPr>
+      <w:tblGrid>
+        <w:gridCol w:w="4824"/>
+        <w:gridCol w:w="4824"/>
+      </w:tblGrid>
+      <w:tr>
+        <w:tc>
+          <w:tcPr>
+            <w:tcW w:type="dxa" w:w="4824"/>
+            <w:tcMar>
+              <w:top w:w="60" w:type="dxa"/>
+              <w:bottom w:w="60" w:type="dxa"/>
+              <w:left w:w="100" w:type="dxa"/>
+              <w:right w:w="100" w:type="dxa"/>
+            </w:tcMar>
+          </w:tcPr>
+          <w:p>
+            <w:r>
+              <w:t>A. 40</w:t>
+            </w:r>
+          </w:p>
+        </w:tc>
+        <w:tc>
+          <w:tcPr>
+            <w:tcW w:type="dxa" w:w="4824"/>
+            <w:tcMar>
+              <w:top w:w="60" w:type="dxa"/>
+              <w:bottom w:w="60" w:type="dxa"/>
+              <w:left w:w="100" w:type="dxa"/>
+              <w:right w:w="100" w:type="dxa"/>
+            </w:tcMar>
+          </w:tcPr>
+          <w:p>
+            <w:r>
+              <w:rPr>
+                <w:highlight w:val="yellow"/>
+              </w:rPr>
+              <w:t>B. 30</w:t>
+            </w:r>
+          </w:p>
+        </w:tc>
+      </w:tr>
+      <w:tr>
+        <w:tc>
+          <w:tcPr>
+            <w:tcW w:type="dxa" w:w="4824"/>
+            <w:tcMar>
+              <w:top w:w="60" w:type="dxa"/>
+              <w:bottom w:w="60" w:type="dxa"/>
+              <w:left w:w="100" w:type="dxa"/>
+              <w:right w:w="100" w:type="dxa"/>
+            </w:tcMar>
+          </w:tcPr>
+          <w:p>
+            <w:r>
+              <w:t>C. 20</w:t>
+            </w:r>
+          </w:p>
+        </w:tc>
+        <w:tc>
+          <w:tcPr>
+            <w:tcW w:type="dxa" w:w="4824"/>
+            <w:tcMar>
+              <w:top w:w="60" w:type="dxa"/>
+              <w:bottom w:w="60" w:type="dxa"/>
+              <w:left w:w="100" w:type="dxa"/>
+              <w:right w:w="100" w:type="dxa"/>
+            </w:tcMar>
+          </w:tcPr>
+          <w:p>
+            <w:r>
+              <w:t>D. 50</w:t>
+            </w:r>
+          </w:p>
+        </w:tc>
+      </w:tr>
+    </w:tbl>
+    <w:p>
+      <w:pPr>
+        <w:spacing w:before="280" w:after="120"/>
+      </w:pPr>
+      <w:r>
+        <w:rPr>
+          <w:b/>
+          <w:color w:val="0F172A"/>
+          <w:sz w:val="26"/>
+        </w:rPr>
+        <w:t>X. Dạng: Phương án đáp án nhiều dòng (Code hoặc văn bản xuống dòng)</w:t>
+      </w:r>
+    </w:p>
+    <w:p>
+      <w:r>
+        <w:rPr>
+          <w:b/>
+        </w:rPr>
+        <w:t xml:space="preserve">Câu 11: </w:t>
+      </w:r>
+      <w:r>
+        <w:t>Trong ngôn ngữ Kotlin, đoạn mã nào sau đây in ra các số từ 1 đến 10 nhưng bỏ qua giá trị 5?</w:t>
+      </w:r>
+    </w:p>
+    <w:tbl>
+      <w:tblPr>
+        <w:tblW w:type="auto" w:w="0"/>
+        <w:jc w:val="center"/>
+        <w:tblLook w:firstColumn="1" w:firstRow="1" w:lastColumn="0" w:lastRow="0" w:noHBand="0" w:noVBand="1" w:val="04A0"/>
+      </w:tblPr>
+      <w:tblGrid>
+        <w:gridCol w:w="4824"/>
+        <w:gridCol w:w="4824"/>
+      </w:tblGrid>
+      <w:tr>
+        <w:tc>
+          <w:tcPr>
+            <w:tcW w:type="dxa" w:w="4824"/>
+            <w:tcMar>
+              <w:top w:w="60" w:type="dxa"/>
+              <w:bottom w:w="60" w:type="dxa"/>
+              <w:left w:w="100" w:type="dxa"/>
+              <w:right w:w="100" w:type="dxa"/>
+            </w:tcMar>
+          </w:tcPr>
+          <w:p>
+            <w:pPr>
+              <w:spacing w:after="20"/>
+            </w:pPr>
+            <w:r>
+              <w:rPr>
+                <w:rFonts w:ascii="Consolas" w:hAnsi="Consolas"/>
+                <w:sz w:val="19"/>
+              </w:rPr>
+              <w:t>A. for (i in 1..10) {</w:t>
+            </w:r>
+          </w:p>
+          <w:p>
+            <w:pPr>
+              <w:spacing w:after="20"/>
+            </w:pPr>
+            <w:r>
+              <w:rPr>
+                <w:rFonts w:ascii="Consolas" w:hAnsi="Consolas"/>
+                <w:sz w:val="19"/>
+              </w:rPr>
+              <w:t xml:space="preserve">    if (i == 5)</w:t>
+            </w:r>
+          </w:p>
+          <w:p>
+            <w:pPr>
+              <w:spacing w:after="20"/>
+            </w:pPr>
+            <w:r>
+              <w:rPr>
+                <w:rFonts w:ascii="Consolas" w:hAnsi="Consolas"/>
+                <w:sz w:val="19"/>
+              </w:rPr>
+              <w:t xml:space="preserve">        println(i)</w:t>
+            </w:r>
+          </w:p>
+          <w:p>
+            <w:pPr>
+              <w:spacing w:after="20"/>
+            </w:pPr>
+            <w:r>
+              <w:rPr>
+                <w:rFonts w:ascii="Consolas" w:hAnsi="Consolas"/>
+                <w:sz w:val="19"/>
+              </w:rPr>
+              <w:t>}</w:t>
+            </w:r>
+          </w:p>
+        </w:tc>
+        <w:tc>
+          <w:tcPr>
+            <w:tcW w:type="dxa" w:w="4824"/>
+            <w:tcMar>
+              <w:top w:w="60" w:type="dxa"/>
+              <w:bottom w:w="60" w:type="dxa"/>
+              <w:left w:w="100" w:type="dxa"/>
+              <w:right w:w="100" w:type="dxa"/>
+            </w:tcMar>
+          </w:tcPr>
+          <w:p>
+            <w:pPr>
+              <w:spacing w:after="20"/>
+            </w:pPr>
+            <w:r>
+              <w:rPr>
+                <w:rFonts w:ascii="Consolas" w:hAnsi="Consolas"/>
+                <w:sz w:val="19"/>
+              </w:rPr>
+              <w:t>B. for (i in 1..10 step 5)</w:t>
+            </w:r>
+          </w:p>
+          <w:p>
+            <w:pPr>
+              <w:spacing w:after="20"/>
+            </w:pPr>
+            <w:r>
+              <w:rPr>
+                <w:rFonts w:ascii="Consolas" w:hAnsi="Consolas"/>
+                <w:sz w:val="19"/>
+              </w:rPr>
+              <w:t xml:space="preserve">    println(i)</w:t>
+            </w:r>
+          </w:p>
+        </w:tc>
+      </w:tr>
+      <w:tr>
+        <w:tc>
+          <w:tcPr>
+            <w:tcW w:type="dxa" w:w="4824"/>
+            <w:tcMar>
+              <w:top w:w="60" w:type="dxa"/>
+              <w:bottom w:w="60" w:type="dxa"/>
+              <w:left w:w="100" w:type="dxa"/>
+              <w:right w:w="100" w:type="dxa"/>
+            </w:tcMar>
+          </w:tcPr>
+          <w:p>
+            <w:pPr>
+              <w:spacing w:after="20"/>
+            </w:pPr>
+            <w:r>
+              <w:rPr>
+                <w:rFonts w:ascii="Consolas" w:hAnsi="Consolas"/>
+                <w:sz w:val="19"/>
+                <w:highlight w:val="yellow"/>
+              </w:rPr>
+              <w:t>C. for (i in 1..10) {</w:t>
+            </w:r>
+          </w:p>
+          <w:p>
+            <w:pPr>
+              <w:spacing w:after="20"/>
+            </w:pPr>
+            <w:r>
+              <w:rPr>
+                <w:rFonts w:ascii="Consolas" w:hAnsi="Consolas"/>
+                <w:sz w:val="19"/>
+                <w:highlight w:val="yellow"/>
+              </w:rPr>
+              <w:t xml:space="preserve">    if (i == 5)</w:t>
+            </w:r>
+          </w:p>
+          <w:p>
+            <w:pPr>
+              <w:spacing w:after="20"/>
+            </w:pPr>
+            <w:r>
+              <w:rPr>
+                <w:rFonts w:ascii="Consolas" w:hAnsi="Consolas"/>
+                <w:sz w:val="19"/>
+                <w:highlight w:val="yellow"/>
+              </w:rPr>
+              <w:t xml:space="preserve">        continue;</w:t>
+            </w:r>
+          </w:p>
+          <w:p>
+            <w:pPr>
+              <w:spacing w:after="20"/>
+            </w:pPr>
+            <w:r>
+              <w:rPr>
+                <w:rFonts w:ascii="Consolas" w:hAnsi="Consolas"/>
+                <w:sz w:val="19"/>
+                <w:highlight w:val="yellow"/>
+              </w:rPr>
+              <w:t xml:space="preserve">    println(i)</w:t>
+            </w:r>
+          </w:p>
+          <w:p>
+            <w:pPr>
+              <w:spacing w:after="20"/>
+            </w:pPr>
+            <w:r>
+              <w:rPr>
+                <w:rFonts w:ascii="Consolas" w:hAnsi="Consolas"/>
+                <w:sz w:val="19"/>
+                <w:highlight w:val="yellow"/>
+              </w:rPr>
+              <w:t>}</w:t>
+            </w:r>
+          </w:p>
+        </w:tc>
+        <w:tc>
+          <w:tcPr>
+            <w:tcW w:type="dxa" w:w="4824"/>
+            <w:tcMar>
+              <w:top w:w="60" w:type="dxa"/>
+              <w:bottom w:w="60" w:type="dxa"/>
+              <w:left w:w="100" w:type="dxa"/>
+              <w:right w:w="100" w:type="dxa"/>
+            </w:tcMar>
+          </w:tcPr>
+          <w:p>
+            <w:pPr>
+              <w:spacing w:after="20"/>
+            </w:pPr>
+            <w:r>
+              <w:rPr>
+                <w:rFonts w:ascii="Consolas" w:hAnsi="Consolas"/>
+                <w:sz w:val="19"/>
+              </w:rPr>
+              <w:t>D. for (i in 1..10)</w:t>
+            </w:r>
+          </w:p>
+          <w:p>
+            <w:pPr>
+              <w:spacing w:after="20"/>
+            </w:pPr>
+            <w:r>
+              <w:rPr>
+                <w:rFonts w:ascii="Consolas" w:hAnsi="Consolas"/>
+                <w:sz w:val="19"/>
+              </w:rPr>
+              <w:t xml:space="preserve">    continue if (i == 5)</w:t>
+            </w:r>
+          </w:p>
+        </w:tc>
+      </w:tr>
+    </w:tbl>
     <w:sectPr>
       <w:pgSz w:w="12240" w:h="15840"/>
       <w:pgMar w:top="1152" w:right="1296" w:bottom="1152" w:left="1296" w:header="720" w:footer="720" w:gutter="0"/>

</xml_diff>

<commit_message>
feat: dinh dang cau 14 va 18 thanh dien tu doan van 4 o trong, bo sung floating side nav co dinh
</commit_message>
<xml_diff>
--- a/Mau_De_Thi_Tat_Ca_Dinh_Dang.docx
+++ b/Mau_De_Thi_Tat_Ca_Dinh_Dang.docx
@@ -94,7 +94,7 @@
                 <w:color w:val="334155"/>
                 <w:sz w:val="20"/>
               </w:rPr>
-              <w:t>3. Đa dạng 6 loại câu hỏi: Chọn 1, Chọn nhiều, Đúng/Sai, Điền từ, Kéo thả ô trống, Ghép đôi (Matching).</w:t>
+              <w:t>3. Đa dạng các loại câu hỏi: Chọn 1, Chọn nhiều, Đúng/Sai, Điền từ (1 ô &amp; nhiều ô theo thứ tự), Kéo thả ô trống, Ghép đôi (Matching).</w:t>
             </w:r>
           </w:p>
           <w:p>
@@ -106,7 +106,7 @@
                 <w:color w:val="334155"/>
                 <w:sz w:val="20"/>
               </w:rPr>
-              <w:t>4. Tự động sửa &amp; bổ sung: Sau khi tải file lên, bạn hoàn toàn có thể thêm đáp án mới (E, F...) và sửa chữ tùy ý.</w:t>
+              <w:t>4. Điền từ nhiều ô trống (Đoạn văn): Đoạn văn có các chỗ trống ______ (1), ______ (2)... Kèm dòng 'Đáp án: 1. từ_1, 2. từ_2...' tương ứng đúng số ô nhập.</w:t>
             </w:r>
           </w:p>
           <w:p>
@@ -118,7 +118,19 @@
                 <w:color w:val="334155"/>
                 <w:sz w:val="20"/>
               </w:rPr>
-              <w:t>5. Câu hỏi &amp; Đáp án nhiều dòng: Hỗ trợ đoạn mã lập trình (Code), văn bản xuống hàng trong cả đề bài và các phương án A, B, C, D.</w:t>
+              <w:t>5. Tự động sửa &amp; bổ sung: Sau khi tải file lên, bạn hoàn toàn có thể thêm đáp án mới (E, F...) và sửa chữ tùy ý.</w:t>
+            </w:r>
+          </w:p>
+          <w:p>
+            <w:pPr>
+              <w:spacing w:after="40"/>
+            </w:pPr>
+            <w:r>
+              <w:rPr>
+                <w:color w:val="334155"/>
+                <w:sz w:val="20"/>
+              </w:rPr>
+              <w:t>6. Câu hỏi &amp; Đáp án nhiều dòng: Hỗ trợ đoạn mã lập trình (Code), văn bản xuống hàng trong cả đề bài và các phương án A, B, C, D.</w:t>
             </w:r>
           </w:p>
         </w:tc>
@@ -563,6 +575,66 @@
     </w:p>
     <w:p>
       <w:pPr>
+        <w:spacing w:before="160"/>
+      </w:pPr>
+      <w:r>
+        <w:rPr>
+          <w:b/>
+        </w:rPr>
+        <w:t xml:space="preserve">Câu 7: </w:t>
+      </w:r>
+      <w:r>
+        <w:t>Điền từ thích hợp vào đoạn văn sau (gồm 4 từ cần điền theo thứ tự):</w:t>
+      </w:r>
+    </w:p>
+    <w:p>
+      <w:pPr>
+        <w:spacing w:after="80"/>
+        <w:ind w:left="360"/>
+      </w:pPr>
+      <w:r>
+        <w:rPr>
+          <w:i/>
+        </w:rPr>
+        <w:t>Một trong những ______ (1) chính dẫn đến cuộc khủng hoảng ______ (2) là do sản xuất phần mềm mang tính ______ (3) và thiếu tính ______ (4).</w:t>
+      </w:r>
+    </w:p>
+    <w:p>
+      <w:pPr>
+        <w:spacing w:after="80"/>
+        <w:ind w:left="360"/>
+      </w:pPr>
+      <w:r>
+        <w:t xml:space="preserve">Đáp án: </w:t>
+      </w:r>
+      <w:r>
+        <w:rPr>
+          <w:highlight w:val="yellow"/>
+        </w:rPr>
+        <w:t>1. nguyên nhân, 2. phần mềm, 3. cá nhân, 4. công nghiệp</w:t>
+      </w:r>
+    </w:p>
+    <w:p>
+      <w:pPr>
+        <w:spacing w:after="160"/>
+        <w:ind w:left="360"/>
+      </w:pPr>
+      <w:r>
+        <w:rPr>
+          <w:b/>
+          <w:sz w:val="20"/>
+        </w:rPr>
+        <w:t xml:space="preserve">➔ Câu hoàn chỉnh: </w:t>
+      </w:r>
+      <w:r>
+        <w:rPr>
+          <w:sz w:val="20"/>
+        </w:rPr>
+        <w:t>“Một trong những [nguyên nhân] chính dẫn đến cuộc khủng hoảng [phần mềm] là do sản xuất phần mềm mang tính [cá nhân] và thiếu tính [công nghiệp].”</w:t>
+      </w:r>
+    </w:p>
+    <w:p>
+      <w:pPr>
         <w:spacing w:before="280" w:after="120"/>
       </w:pPr>
       <w:r>
@@ -579,7 +651,7 @@
         <w:rPr>
           <w:b/>
         </w:rPr>
-        <w:t xml:space="preserve">Câu 7: </w:t>
+        <w:t xml:space="preserve">Câu 8: </w:t>
       </w:r>
       <w:r>
         <w:t>Kéo thả các giao thức và thiết bị thích hợp vào các câu sau (Mỗi câu có thể kéo nhiều đáp án):</w:t>
@@ -723,7 +795,7 @@
         <w:rPr>
           <w:b/>
         </w:rPr>
-        <w:t xml:space="preserve">Câu 8: </w:t>
+        <w:t xml:space="preserve">Câu 9: </w:t>
       </w:r>
       <w:r>
         <w:t>Hãy ghép nối từng nguyên tắc thiết kế phần mềm SOLID với ý nghĩa tương ứng:</w:t>
@@ -946,7 +1018,7 @@
           <w:color w:val="0F172A"/>
           <w:sz w:val="26"/>
         </w:rPr>
-        <w:t>VIII. Dạng bổ trợ: Tự nhận diện khi không có Highlight (Fallback 'Đáp án: C')</w:t>
+        <w:t>VIII. Dạng bổ trợ: Tự nhận diện khi không có Highlight (Fallback 'Đáp án: B')</w:t>
       </w:r>
     </w:p>
     <w:p>
@@ -954,7 +1026,7 @@
         <w:rPr>
           <w:b/>
         </w:rPr>
-        <w:t xml:space="preserve">Câu 9: </w:t>
+        <w:t xml:space="preserve">Câu 10: </w:t>
       </w:r>
       <w:r>
         <w:t>Đơn vị đo lường tốc độ truyền dữ liệu qua mạng thông dụng nhất là gì?</w:t>
@@ -1027,7 +1099,7 @@
         <w:rPr>
           <w:b/>
         </w:rPr>
-        <w:t xml:space="preserve">Câu 10: </w:t>
+        <w:t xml:space="preserve">Câu 11: </w:t>
       </w:r>
       <w:r>
         <w:t>Cho đoạn mã chương trình Kotlin sau:</w:t>
@@ -1281,7 +1353,7 @@
         <w:rPr>
           <w:b/>
         </w:rPr>
-        <w:t xml:space="preserve">Câu 11: </w:t>
+        <w:t xml:space="preserve">Câu 12: </w:t>
       </w:r>
       <w:r>
         <w:t>Trong ngôn ngữ Kotlin, đoạn mã nào sau đây in ra các số từ 1 đến 10 nhưng bỏ qua giá trị 5?</w:t>

</xml_diff>